<commit_message>
v2.37 (John's word, 13 October): the school calendar stripped from Evenings 9-14 (and stray lines in 2, 4, 15, 16): no Christmas, spring break, January or Wednesdays; the two built-in returns kept with a note that the break may be just the two weeks; Evening 13's Christmas precedent removed
Co-Authored-By: Claude Opus 5.5 <noreply@anthropic.com>
</commit_message>
<xml_diff>
--- a/_implementation-notes/evening-series/FotH Pilot Session 12 Evening Run Sheet DRAFT v1.docx
+++ b/_implementation-notes/evening-series/FotH Pilot Session 12 Evening Run Sheet DRAFT v1.docx
@@ -96,14 +96,10 @@
           <w:b/>
           <w:bCs/>
         </w:rPr>
-        <w:t xml:space="preserve">Aim (from the school version).</w:t>
-      </w:r>
-      <w:r>
-        <w:t xml:space="preserve"> </w:t>
-      </w:r>
-      <w:r>
-        <w:t xml:space="preserve">Full re-entry after the Christmas break. Every break is a natural test of whether the practices survived without the container holding them — tonight rebuilds the room, reads without shame what held and what slipped, welcomes back anyone who drifted, and re-anchors the cohort in the year’s map. Slips are data, not failure. The door is the whole point.</w:t>
-      </w:r>
+        <w:t>Aim (from the school version). Full re-entry after a break. Every break is a natural test of whether the practices survived without the container holding them — tonight rebuilds the room, reads without shame what held and what slipped, welcomes back anyone who drifted, and re-anchors the cohort in the year’s map. Slips are data, not failure. The door is the whole point.</w:t>
+      </w:r>
+      <w:r/>
+      <w:r/>
     </w:p>
     <w:p>
       <w:pPr>

</xml_diff>